<commit_message>
Actualizar archivos corregidos de documentación
</commit_message>
<xml_diff>
--- a/docs/Product Vision.docx
+++ b/docs/Product Vision.docx
@@ -85,7 +85,13 @@
     </w:p>
     <w:p>
       <w:r>
-        <w:t>El juego cuenta con 10 niveles de dificultad progresiva. Al finalizar cada nivel, el jugador deberá resolver correctamente una operación matemática para avanzar. Si la respuesta es incorrecta, el juego se reinicia desde el nivel 0 y el puntaje vuelve a cero.</w:t>
+        <w:t xml:space="preserve">El juego cuenta con </w:t>
+      </w:r>
+      <w:r>
+        <w:t>3</w:t>
+      </w:r>
+      <w:r>
+        <w:t xml:space="preserve"> niveles de dificultad progresiva. Al finalizar cada nivel, el jugador deberá resolver correctamente una operación matemática para avanzar. Si la respuesta es incorrecta, el juego se reinicia desde el nivel 0 y el puntaje vuelve a cero.</w:t>
       </w:r>
     </w:p>
     <w:p>
@@ -147,7 +153,13 @@
         </w:numPr>
       </w:pPr>
       <w:r>
-        <w:t>Este aumento será constante hasta el nivel 10, donde la velocidad será máxima.</w:t>
+        <w:t xml:space="preserve">Este aumento será constante hasta el nivel </w:t>
+      </w:r>
+      <w:r>
+        <w:t>3</w:t>
+      </w:r>
+      <w:r>
+        <w:t>, donde la velocidad será máxima.</w:t>
       </w:r>
     </w:p>
     <w:p>
@@ -166,42 +178,76 @@
       </w:r>
     </w:p>
     <w:p>
+      <w:r>
+        <w:t>La complejidad de las operaciones se ajustará a cada nivel de la siguiente manera:</w:t>
+      </w:r>
+    </w:p>
+    <w:p>
       <w:pPr>
         <w:numPr>
-          <w:ilvl w:val="1"/>
-          <w:numId w:val="4"/>
+          <w:ilvl w:val="0"/>
+          <w:numId w:val="5"/>
         </w:numPr>
       </w:pPr>
       <w:r>
-        <w:t>En los primeros niveles, las operaciones serán sencillas (sumas y restas de un solo dígito).</w:t>
+        <w:rPr>
+          <w:b/>
+          <w:bCs/>
+        </w:rPr>
+        <w:t>Nivel 1:</w:t>
+      </w:r>
+      <w:r>
+        <w:t xml:space="preserve"> Operaciones de suma o resta con un dígito.</w:t>
       </w:r>
     </w:p>
     <w:p>
       <w:pPr>
         <w:numPr>
-          <w:ilvl w:val="1"/>
-          <w:numId w:val="4"/>
+          <w:ilvl w:val="0"/>
+          <w:numId w:val="5"/>
         </w:numPr>
       </w:pPr>
       <w:r>
-        <w:t>A partir de niveles intermedios, se incluirán operaciones con dos dígitos y multiplicaciones básicas.</w:t>
+        <w:rPr>
+          <w:b/>
+          <w:bCs/>
+        </w:rPr>
+        <w:t>Nivel 2:</w:t>
+      </w:r>
+      <w:r>
+        <w:t xml:space="preserve"> Operaciones de suma o resta con dos dígitos.</w:t>
       </w:r>
     </w:p>
     <w:p>
       <w:pPr>
         <w:numPr>
-          <w:ilvl w:val="1"/>
-          <w:numId w:val="4"/>
+          <w:ilvl w:val="0"/>
+          <w:numId w:val="5"/>
         </w:numPr>
       </w:pPr>
       <w:r>
-        <w:t>En los niveles más altos, se presentarán operaciones más largas (hasta tres dígitos) que requerirán mayor concentración y cálculo mental.</w:t>
+        <w:rPr>
+          <w:b/>
+          <w:bCs/>
+        </w:rPr>
+        <w:t>Nivel 3:</w:t>
+      </w:r>
+      <w:r>
+        <w:t xml:space="preserve"> Operaciones de multiplicación con un dígito.</w:t>
       </w:r>
     </w:p>
     <w:p>
       <w:r>
         <w:t>Este sistema busca mantener el interés y el reto del jugador, combinando la agilidad mental y motriz con el aprendizaje matemático.</w:t>
       </w:r>
+    </w:p>
+    <w:p>
+      <w:pPr>
+        <w:rPr>
+          <w:b/>
+          <w:bCs/>
+        </w:rPr>
+      </w:pPr>
     </w:p>
     <w:p>
       <w:pPr>
@@ -240,7 +286,13 @@
         </w:numPr>
       </w:pPr>
       <w:r>
-        <w:t>Implementar mecánicas clásicas de Tetris con 10 niveles de dificultad progresiva.</w:t>
+        <w:t xml:space="preserve">Implementar mecánicas clásicas de Tetris con </w:t>
+      </w:r>
+      <w:r>
+        <w:t>3</w:t>
+      </w:r>
+      <w:r>
+        <w:t xml:space="preserve"> niveles de dificultad progresiva.</w:t>
       </w:r>
     </w:p>
     <w:p>
@@ -316,7 +368,13 @@
       </w:r>
       <w:proofErr w:type="spellStart"/>
       <w:r>
-        <w:t>Pygame</w:t>
+        <w:t>Py</w:t>
+      </w:r>
+      <w:r>
+        <w:t>G</w:t>
+      </w:r>
+      <w:r>
+        <w:t>ame</w:t>
       </w:r>
       <w:proofErr w:type="spellEnd"/>
       <w:r>
@@ -676,6 +734,155 @@
     </w:lvl>
   </w:abstractNum>
   <w:abstractNum w:abstractNumId="3" w15:restartNumberingAfterBreak="0">
+    <w:nsid w:val="3D5F1B2A"/>
+    <w:multiLevelType w:val="multilevel"/>
+    <w:tmpl w:val="A0323E16"/>
+    <w:lvl w:ilvl="0">
+      <w:start w:val="1"/>
+      <w:numFmt w:val="bullet"/>
+      <w:lvlText w:val=""/>
+      <w:lvlJc w:val="left"/>
+      <w:pPr>
+        <w:tabs>
+          <w:tab w:val="num" w:pos="720"/>
+        </w:tabs>
+        <w:ind w:left="720" w:hanging="360"/>
+      </w:pPr>
+      <w:rPr>
+        <w:rFonts w:ascii="Symbol" w:hAnsi="Symbol" w:hint="default"/>
+        <w:sz w:val="20"/>
+      </w:rPr>
+    </w:lvl>
+    <w:lvl w:ilvl="1" w:tentative="1">
+      <w:start w:val="1"/>
+      <w:numFmt w:val="bullet"/>
+      <w:lvlText w:val="o"/>
+      <w:lvlJc w:val="left"/>
+      <w:pPr>
+        <w:tabs>
+          <w:tab w:val="num" w:pos="1440"/>
+        </w:tabs>
+        <w:ind w:left="1440" w:hanging="360"/>
+      </w:pPr>
+      <w:rPr>
+        <w:rFonts w:ascii="Courier New" w:hAnsi="Courier New" w:hint="default"/>
+        <w:sz w:val="20"/>
+      </w:rPr>
+    </w:lvl>
+    <w:lvl w:ilvl="2" w:tentative="1">
+      <w:start w:val="1"/>
+      <w:numFmt w:val="bullet"/>
+      <w:lvlText w:val=""/>
+      <w:lvlJc w:val="left"/>
+      <w:pPr>
+        <w:tabs>
+          <w:tab w:val="num" w:pos="2160"/>
+        </w:tabs>
+        <w:ind w:left="2160" w:hanging="360"/>
+      </w:pPr>
+      <w:rPr>
+        <w:rFonts w:ascii="Wingdings" w:hAnsi="Wingdings" w:hint="default"/>
+        <w:sz w:val="20"/>
+      </w:rPr>
+    </w:lvl>
+    <w:lvl w:ilvl="3" w:tentative="1">
+      <w:start w:val="1"/>
+      <w:numFmt w:val="bullet"/>
+      <w:lvlText w:val=""/>
+      <w:lvlJc w:val="left"/>
+      <w:pPr>
+        <w:tabs>
+          <w:tab w:val="num" w:pos="2880"/>
+        </w:tabs>
+        <w:ind w:left="2880" w:hanging="360"/>
+      </w:pPr>
+      <w:rPr>
+        <w:rFonts w:ascii="Wingdings" w:hAnsi="Wingdings" w:hint="default"/>
+        <w:sz w:val="20"/>
+      </w:rPr>
+    </w:lvl>
+    <w:lvl w:ilvl="4" w:tentative="1">
+      <w:start w:val="1"/>
+      <w:numFmt w:val="bullet"/>
+      <w:lvlText w:val=""/>
+      <w:lvlJc w:val="left"/>
+      <w:pPr>
+        <w:tabs>
+          <w:tab w:val="num" w:pos="3600"/>
+        </w:tabs>
+        <w:ind w:left="3600" w:hanging="360"/>
+      </w:pPr>
+      <w:rPr>
+        <w:rFonts w:ascii="Wingdings" w:hAnsi="Wingdings" w:hint="default"/>
+        <w:sz w:val="20"/>
+      </w:rPr>
+    </w:lvl>
+    <w:lvl w:ilvl="5" w:tentative="1">
+      <w:start w:val="1"/>
+      <w:numFmt w:val="bullet"/>
+      <w:lvlText w:val=""/>
+      <w:lvlJc w:val="left"/>
+      <w:pPr>
+        <w:tabs>
+          <w:tab w:val="num" w:pos="4320"/>
+        </w:tabs>
+        <w:ind w:left="4320" w:hanging="360"/>
+      </w:pPr>
+      <w:rPr>
+        <w:rFonts w:ascii="Wingdings" w:hAnsi="Wingdings" w:hint="default"/>
+        <w:sz w:val="20"/>
+      </w:rPr>
+    </w:lvl>
+    <w:lvl w:ilvl="6" w:tentative="1">
+      <w:start w:val="1"/>
+      <w:numFmt w:val="bullet"/>
+      <w:lvlText w:val=""/>
+      <w:lvlJc w:val="left"/>
+      <w:pPr>
+        <w:tabs>
+          <w:tab w:val="num" w:pos="5040"/>
+        </w:tabs>
+        <w:ind w:left="5040" w:hanging="360"/>
+      </w:pPr>
+      <w:rPr>
+        <w:rFonts w:ascii="Wingdings" w:hAnsi="Wingdings" w:hint="default"/>
+        <w:sz w:val="20"/>
+      </w:rPr>
+    </w:lvl>
+    <w:lvl w:ilvl="7" w:tentative="1">
+      <w:start w:val="1"/>
+      <w:numFmt w:val="bullet"/>
+      <w:lvlText w:val=""/>
+      <w:lvlJc w:val="left"/>
+      <w:pPr>
+        <w:tabs>
+          <w:tab w:val="num" w:pos="5760"/>
+        </w:tabs>
+        <w:ind w:left="5760" w:hanging="360"/>
+      </w:pPr>
+      <w:rPr>
+        <w:rFonts w:ascii="Wingdings" w:hAnsi="Wingdings" w:hint="default"/>
+        <w:sz w:val="20"/>
+      </w:rPr>
+    </w:lvl>
+    <w:lvl w:ilvl="8" w:tentative="1">
+      <w:start w:val="1"/>
+      <w:numFmt w:val="bullet"/>
+      <w:lvlText w:val=""/>
+      <w:lvlJc w:val="left"/>
+      <w:pPr>
+        <w:tabs>
+          <w:tab w:val="num" w:pos="6480"/>
+        </w:tabs>
+        <w:ind w:left="6480" w:hanging="360"/>
+      </w:pPr>
+      <w:rPr>
+        <w:rFonts w:ascii="Wingdings" w:hAnsi="Wingdings" w:hint="default"/>
+        <w:sz w:val="20"/>
+      </w:rPr>
+    </w:lvl>
+  </w:abstractNum>
+  <w:abstractNum w:abstractNumId="4" w15:restartNumberingAfterBreak="0">
     <w:nsid w:val="425D1EF5"/>
     <w:multiLevelType w:val="multilevel"/>
     <w:tmpl w:val="A4BE9F0A"/>
@@ -790,19 +997,174 @@
         </w:tabs>
         <w:ind w:left="6480" w:hanging="360"/>
       </w:pPr>
+    </w:lvl>
+  </w:abstractNum>
+  <w:abstractNum w:abstractNumId="5" w15:restartNumberingAfterBreak="0">
+    <w:nsid w:val="45B44791"/>
+    <w:multiLevelType w:val="multilevel"/>
+    <w:tmpl w:val="9E883EA2"/>
+    <w:lvl w:ilvl="0">
+      <w:start w:val="1"/>
+      <w:numFmt w:val="bullet"/>
+      <w:lvlText w:val=""/>
+      <w:lvlJc w:val="left"/>
+      <w:pPr>
+        <w:tabs>
+          <w:tab w:val="num" w:pos="720"/>
+        </w:tabs>
+        <w:ind w:left="720" w:hanging="360"/>
+      </w:pPr>
+      <w:rPr>
+        <w:rFonts w:ascii="Symbol" w:hAnsi="Symbol" w:hint="default"/>
+        <w:sz w:val="20"/>
+      </w:rPr>
+    </w:lvl>
+    <w:lvl w:ilvl="1" w:tentative="1">
+      <w:start w:val="1"/>
+      <w:numFmt w:val="bullet"/>
+      <w:lvlText w:val="o"/>
+      <w:lvlJc w:val="left"/>
+      <w:pPr>
+        <w:tabs>
+          <w:tab w:val="num" w:pos="1440"/>
+        </w:tabs>
+        <w:ind w:left="1440" w:hanging="360"/>
+      </w:pPr>
+      <w:rPr>
+        <w:rFonts w:ascii="Courier New" w:hAnsi="Courier New" w:hint="default"/>
+        <w:sz w:val="20"/>
+      </w:rPr>
+    </w:lvl>
+    <w:lvl w:ilvl="2" w:tentative="1">
+      <w:start w:val="1"/>
+      <w:numFmt w:val="bullet"/>
+      <w:lvlText w:val=""/>
+      <w:lvlJc w:val="left"/>
+      <w:pPr>
+        <w:tabs>
+          <w:tab w:val="num" w:pos="2160"/>
+        </w:tabs>
+        <w:ind w:left="2160" w:hanging="360"/>
+      </w:pPr>
+      <w:rPr>
+        <w:rFonts w:ascii="Wingdings" w:hAnsi="Wingdings" w:hint="default"/>
+        <w:sz w:val="20"/>
+      </w:rPr>
+    </w:lvl>
+    <w:lvl w:ilvl="3" w:tentative="1">
+      <w:start w:val="1"/>
+      <w:numFmt w:val="bullet"/>
+      <w:lvlText w:val=""/>
+      <w:lvlJc w:val="left"/>
+      <w:pPr>
+        <w:tabs>
+          <w:tab w:val="num" w:pos="2880"/>
+        </w:tabs>
+        <w:ind w:left="2880" w:hanging="360"/>
+      </w:pPr>
+      <w:rPr>
+        <w:rFonts w:ascii="Wingdings" w:hAnsi="Wingdings" w:hint="default"/>
+        <w:sz w:val="20"/>
+      </w:rPr>
+    </w:lvl>
+    <w:lvl w:ilvl="4" w:tentative="1">
+      <w:start w:val="1"/>
+      <w:numFmt w:val="bullet"/>
+      <w:lvlText w:val=""/>
+      <w:lvlJc w:val="left"/>
+      <w:pPr>
+        <w:tabs>
+          <w:tab w:val="num" w:pos="3600"/>
+        </w:tabs>
+        <w:ind w:left="3600" w:hanging="360"/>
+      </w:pPr>
+      <w:rPr>
+        <w:rFonts w:ascii="Wingdings" w:hAnsi="Wingdings" w:hint="default"/>
+        <w:sz w:val="20"/>
+      </w:rPr>
+    </w:lvl>
+    <w:lvl w:ilvl="5" w:tentative="1">
+      <w:start w:val="1"/>
+      <w:numFmt w:val="bullet"/>
+      <w:lvlText w:val=""/>
+      <w:lvlJc w:val="left"/>
+      <w:pPr>
+        <w:tabs>
+          <w:tab w:val="num" w:pos="4320"/>
+        </w:tabs>
+        <w:ind w:left="4320" w:hanging="360"/>
+      </w:pPr>
+      <w:rPr>
+        <w:rFonts w:ascii="Wingdings" w:hAnsi="Wingdings" w:hint="default"/>
+        <w:sz w:val="20"/>
+      </w:rPr>
+    </w:lvl>
+    <w:lvl w:ilvl="6" w:tentative="1">
+      <w:start w:val="1"/>
+      <w:numFmt w:val="bullet"/>
+      <w:lvlText w:val=""/>
+      <w:lvlJc w:val="left"/>
+      <w:pPr>
+        <w:tabs>
+          <w:tab w:val="num" w:pos="5040"/>
+        </w:tabs>
+        <w:ind w:left="5040" w:hanging="360"/>
+      </w:pPr>
+      <w:rPr>
+        <w:rFonts w:ascii="Wingdings" w:hAnsi="Wingdings" w:hint="default"/>
+        <w:sz w:val="20"/>
+      </w:rPr>
+    </w:lvl>
+    <w:lvl w:ilvl="7" w:tentative="1">
+      <w:start w:val="1"/>
+      <w:numFmt w:val="bullet"/>
+      <w:lvlText w:val=""/>
+      <w:lvlJc w:val="left"/>
+      <w:pPr>
+        <w:tabs>
+          <w:tab w:val="num" w:pos="5760"/>
+        </w:tabs>
+        <w:ind w:left="5760" w:hanging="360"/>
+      </w:pPr>
+      <w:rPr>
+        <w:rFonts w:ascii="Wingdings" w:hAnsi="Wingdings" w:hint="default"/>
+        <w:sz w:val="20"/>
+      </w:rPr>
+    </w:lvl>
+    <w:lvl w:ilvl="8" w:tentative="1">
+      <w:start w:val="1"/>
+      <w:numFmt w:val="bullet"/>
+      <w:lvlText w:val=""/>
+      <w:lvlJc w:val="left"/>
+      <w:pPr>
+        <w:tabs>
+          <w:tab w:val="num" w:pos="6480"/>
+        </w:tabs>
+        <w:ind w:left="6480" w:hanging="360"/>
+      </w:pPr>
+      <w:rPr>
+        <w:rFonts w:ascii="Wingdings" w:hAnsi="Wingdings" w:hint="default"/>
+        <w:sz w:val="20"/>
+      </w:rPr>
     </w:lvl>
   </w:abstractNum>
   <w:num w:numId="1" w16cid:durableId="2089770280">
     <w:abstractNumId w:val="2"/>
   </w:num>
   <w:num w:numId="2" w16cid:durableId="1424454551">
-    <w:abstractNumId w:val="3"/>
+    <w:abstractNumId w:val="4"/>
   </w:num>
   <w:num w:numId="3" w16cid:durableId="729306790">
     <w:abstractNumId w:val="0"/>
   </w:num>
   <w:num w:numId="4" w16cid:durableId="977762375">
     <w:abstractNumId w:val="1"/>
+  </w:num>
+  <w:num w:numId="5" w16cid:durableId="275524182">
+    <w:abstractNumId w:val="5"/>
+  </w:num>
+  <w:num w:numId="6" w16cid:durableId="699477788">
+    <w:abstractNumId w:val="3"/>
   </w:num>
 </w:numbering>
 </file>
@@ -1411,7 +1773,6 @@
   <w:style w:type="character" w:default="1" w:styleId="Fuentedeprrafopredeter">
     <w:name w:val="Default Paragraph Font"/>
     <w:uiPriority w:val="1"/>
-    <w:semiHidden/>
     <w:unhideWhenUsed/>
   </w:style>
   <w:style w:type="table" w:default="1" w:styleId="Tablanormal">

</xml_diff>